<commit_message>
docs: add strategic time constraint rationale to word deliverable and logs
</commit_message>
<xml_diff>
--- a/challenge-banana-candidate/challenge-banana-candidate/submission/banana-bank-entregable.docx
+++ b/challenge-banana-candidate/challenge-banana-candidate/submission/banana-bank-entregable.docx
@@ -538,6 +538,42 @@
     <w:p>
       <w:r>
         <w:t>Para profesionalizar el ciclo de desarrollo y garantizar un proceso repetible, se implementó un sistema gobernado por AGENTS.md y roles modulares en .agents/roles/. El procedimiento operativo cubre el ciclo de vida completo de cada funcionalidad:</w:t>
+      </w:r>
+    </w:p>
+    <w:p>
+      <w:pPr>
+        <w:spacing w:before="240" w:after="80"/>
+      </w:pPr>
+      <w:r>
+        <w:rPr>
+          <w:rFonts w:ascii="Arial" w:hAnsi="Arial"/>
+          <w:b/>
+          <w:color w:val="2D2D2D"/>
+          <w:sz w:val="23"/>
+        </w:rPr>
+        <w:t>3.1 Justificación Estratégica: Optimización ante la Restricción de Tiempo</w:t>
+      </w:r>
+    </w:p>
+    <w:p>
+      <w:r>
+        <w:t>La adopción de este flujo de agentes modulares y asistidos por IA fue una decisión estratégica fundamentada en la gestión óptima del tiempo disponible. Ante la envergadura del challenge (reparar integralmente la lógica financiera, diseñar una nueva feature compleja de soporte y documentar rigurosamente los resultados) dentro de un plazo acotado de entrega, un enfoque manual tradicional habría forzado compromisos indeseables: recortar la profundidad de las pruebas o simplificar la funcionalidad de soporte.</w:t>
+        <w:br/>
+        <w:br/>
+        <w:t>Estructurar el desarrollo en roles desacoplados (.agents/roles/) permitió maximizar la velocidad de ejecución sin resignar rigor técnico: permitió concentrar la atención y supervisión humana de Maximo Porretti en las decisiones arquitectónicas de mayor impacto (inmutabilidad de propuestas, idempotencia atómica, invariantes de seguridad y observabilidad de evidencia), delegando en los asistentes de IA la codificación ágil de módulos, la ejecución de suites de pruebas exhaustivas y la generación de trazabilidad técnica reproducible.</w:t>
+      </w:r>
+    </w:p>
+    <w:p>
+      <w:pPr>
+        <w:spacing w:before="240" w:after="80"/>
+      </w:pPr>
+      <w:r>
+        <w:rPr>
+          <w:rFonts w:ascii="Arial" w:hAnsi="Arial"/>
+          <w:b/>
+          <w:color w:val="2D2D2D"/>
+          <w:sz w:val="23"/>
+        </w:rPr>
+        <w:t>3.2 Estructura y Componentes del Sistema de Agentes</w:t>
       </w:r>
     </w:p>
     <w:p>

</xml_diff>

<commit_message>
feat: define .agent full workflow, update word deliverable with official subject, and prune redundant docs
</commit_message>
<xml_diff>
--- a/challenge-banana-candidate/challenge-banana-candidate/submission/banana-bank-entregable.docx
+++ b/challenge-banana-candidate/challenge-banana-candidate/submission/banana-bank-entregable.docx
@@ -14,7 +14,7 @@
           <w:color w:val="111111"/>
           <w:sz w:val="44"/>
         </w:rPr>
-        <w:t>Desarrollo y Entrega de Banana Bank</w:t>
+        <w:t>Desarrollo y Entrega Técnica de Banana Bank</w:t>
       </w:r>
     </w:p>
     <w:p>
@@ -28,7 +28,7 @@
           <w:color w:val="5A5A5A"/>
           <w:sz w:val="23"/>
         </w:rPr>
-        <w:t>Documentación Técnica Integral: Requerimientos del Challenge, Flujo de Agentes (.agents), Fixes Financieros y Asistente de Soporte con Evidencia</w:t>
+        <w:t>Documento Explicativo Oficial: Flujo de Agentes (.agent), Fixes Financieros, Copilot de Soporte y Evidencias de Verificación</w:t>
       </w:r>
     </w:p>
     <w:tbl>
@@ -118,7 +118,7 @@
                 <w:color w:val="232323"/>
                 <w:sz w:val="18"/>
               </w:rPr>
-              <w:t>Candidato</w:t>
+              <w:t>Candidato (Autor)</w:t>
             </w:r>
           </w:p>
         </w:tc>
@@ -170,7 +170,7 @@
                 <w:color w:val="232323"/>
                 <w:sz w:val="18"/>
               </w:rPr>
-              <w:t>Fecha de Entrega</w:t>
+              <w:t>Asunto Oficial del Correo</w:t>
             </w:r>
           </w:p>
         </w:tc>
@@ -195,7 +195,7 @@
                 <w:color w:val="232323"/>
                 <w:sz w:val="18"/>
               </w:rPr>
-              <w:t>14 de octubre de 2026</w:t>
+              <w:t>Maximo Porretti - Banana Bank Technical Challenge</w:t>
             </w:r>
           </w:p>
         </w:tc>
@@ -222,7 +222,7 @@
                 <w:color w:val="232323"/>
                 <w:sz w:val="18"/>
               </w:rPr>
-              <w:t>Asunto Oficial del Correo</w:t>
+              <w:t>Fecha de Entrega</w:t>
             </w:r>
           </w:p>
         </w:tc>
@@ -247,7 +247,7 @@
                 <w:color w:val="232323"/>
                 <w:sz w:val="18"/>
               </w:rPr>
-              <w:t>Maximo Porretti - Banana Bank Technical Challenge</w:t>
+              <w:t>14 de octubre de 2026</w:t>
             </w:r>
           </w:p>
         </w:tc>
@@ -299,7 +299,7 @@
                 <w:color w:val="232323"/>
                 <w:sz w:val="18"/>
               </w:rPr>
-              <w:t>hr@tdots.es (canal documentado en starter)</w:t>
+              <w:t>hr@tdots.es (según especificación del challenge)</w:t>
             </w:r>
           </w:p>
         </w:tc>
@@ -378,6 +378,58 @@
                 <w:color w:val="232323"/>
                 <w:sz w:val="18"/>
               </w:rPr>
+              <w:t>Sesiones de IA Incluidas</w:t>
+            </w:r>
+          </w:p>
+        </w:tc>
+        <w:tc>
+          <w:tcPr>
+            <w:tcW w:type="dxa" w:w="6048"/>
+            <w:shd w:fill="F5F5F5"/>
+            <w:tcMar>
+              <w:top w:w="90" w:type="dxa"/>
+              <w:bottom w:w="90" w:type="dxa"/>
+              <w:left w:w="130" w:type="dxa"/>
+              <w:right w:w="130" w:type="dxa"/>
+            </w:tcMar>
+          </w:tcPr>
+          <w:p>
+            <w:pPr>
+              <w:jc w:val="left"/>
+            </w:pPr>
+            <w:r>
+              <w:rPr>
+                <w:rFonts w:ascii="Arial" w:hAnsi="Arial"/>
+                <w:color w:val="232323"/>
+                <w:sz w:val="18"/>
+              </w:rPr>
+              <w:t>submission/ai-sessions/ (formato JSONL original con hashes SHA-256)</w:t>
+            </w:r>
+          </w:p>
+        </w:tc>
+      </w:tr>
+      <w:tr>
+        <w:tc>
+          <w:tcPr>
+            <w:tcW w:type="dxa" w:w="3312"/>
+            <w:shd w:fill="FFFFFF"/>
+            <w:tcMar>
+              <w:top w:w="90" w:type="dxa"/>
+              <w:bottom w:w="90" w:type="dxa"/>
+              <w:left w:w="130" w:type="dxa"/>
+              <w:right w:w="130" w:type="dxa"/>
+            </w:tcMar>
+          </w:tcPr>
+          <w:p>
+            <w:pPr>
+              <w:jc w:val="left"/>
+            </w:pPr>
+            <w:r>
+              <w:rPr>
+                <w:rFonts w:ascii="Arial" w:hAnsi="Arial"/>
+                <w:color w:val="232323"/>
+                <w:sz w:val="18"/>
+              </w:rPr>
               <w:t>Resultado de Verificación</w:t>
             </w:r>
           </w:p>
@@ -385,7 +437,7 @@
         <w:tc>
           <w:tcPr>
             <w:tcW w:type="dxa" w:w="6048"/>
-            <w:shd w:fill="F5F5F5"/>
+            <w:shd w:fill="FFFFFF"/>
             <w:tcMar>
               <w:top w:w="90" w:type="dxa"/>
               <w:bottom w:w="90" w:type="dxa"/>
@@ -425,12 +477,12 @@
           <w:color w:val="191919"/>
           <w:sz w:val="29"/>
         </w:rPr>
-        <w:t>1. ¿Qué nos pedía el trabajo? (Alcance Oficial del Challenge)</w:t>
+        <w:t>1. Alcance Oficial del Challenge y Requerimientos</w:t>
       </w:r>
     </w:p>
     <w:p>
       <w:r>
-        <w:t>El challenge Banana Bank ubica al candidato en la situación de unirse al equipo técnico de un banco ficticio que planea lanzar su asistente de inteligencia artificial para clientes y operadores el próximo lunes. La empresa facilitó un proyecto funcional inicial (aplicación web Next.js con chat de IA, datos simulados y un servicio bancario externo en simulator/), pero requería evidencia rigurosa de confiabilidad y una funcionalidad innovadora. El requerimiento formal exigió abordar dos partes principales más la entrega en un paquete único:</w:t>
+        <w:t>El challenge Banana Bank ubica al candidato en la situación de unirse al equipo técnico de una entidad bancaria ficticia que planea lanzar su asistente de inteligencia artificial para clientes y operadores el próximo lunes. La empresa facilitó un proyecto funcional inicial (aplicación web Next.js con chat de IA, datos simulados y un servicio bancario externo en simulator/), pero requería evidencia rigurosa de confiabilidad y una funcionalidad innovadora. El requerimiento formal exigió abordar dos partes principales más la entrega en un paquete único y reproducible:</w:t>
       </w:r>
     </w:p>
     <w:p>
@@ -446,7 +498,7 @@
         <w:t xml:space="preserve">Parte 1 - Preparar la app para el lunes (40% de la evaluación): </w:t>
       </w:r>
       <w:r>
-        <w:t>Explorar el código starter, encontrar problemas reales y reproducibles, y corregir a fondo los defectos críticos elegidos. Se exigió enfocarse en la integridad de las transferencias, la integración con el banco y la seguridad, sin alterar el simulador bancario externo (tratado como caja negra). Aportar evidencia cuantitativa y demostrable de 'Antes vs. Después'.</w:t>
+        <w:t>Explorar el código starter, encontrar problemas reales y reproducibles, y corregir a fondo los defectos críticos elegidos. Se exigió enfocarse en la integridad de las transferencias, la integración con el banco y la seguridad, sin alterar el simulador bancario externo (tratado como caja negra inmutable). Aportar evidencia cuantitativa y demostrable de 'Antes vs. Después'.</w:t>
       </w:r>
     </w:p>
     <w:p>
@@ -478,7 +530,7 @@
         <w:t xml:space="preserve">Metodología, Verificación y Entrega (20% de la evaluación): </w:t>
       </w:r>
       <w:r>
-        <w:t>Explicar las decisiones técnicas, ejecutar pruebas automatizadas completas y empaquetar todo en un único archivo ZIP reproducible. El ZIP debe incluir el código completo, las sesiones originales de IA (en submission/ai-sessions/), y el documento o video explicativo, excluyendo node_modules, .next, .data, bases de datos locales y credenciales privadas.</w:t>
+        <w:t>Explicar las decisiones técnicas, ejecutar pruebas automatizadas completas y empaquetar todo en un único archivo ZIP reproducible. El ZIP debe incluir el código completo, las sesiones originales de IA (en submission/ai-sessions/), y el documento explicativo en Word, excluyendo node_modules, .next, .data, bases de datos locales y credenciales privadas.</w:t>
       </w:r>
     </w:p>
     <w:p>
@@ -491,10 +543,10 @@
           <w:b/>
           <w:color w:val="191919"/>
         </w:rPr>
-        <w:t xml:space="preserve">Requerimiento Adicional del Candidato: </w:t>
+        <w:t xml:space="preserve">Requerimiento de Autoría y Flujo de Agentes: </w:t>
       </w:r>
       <w:r>
-        <w:t>Maximo Porretti solicitó diseñar, estructurar y documentar un flujo modular de agentes (.agents/roles/ y .agents/skills/) que cubra de punta a punta el desarrollo (desde la captura de requerimientos hasta el empaquetado final), documentando su autoría en el diseño del flujo y la dirección de la asistencia de IA.</w:t>
+        <w:t>Maximo Porretti diseñó, estructuró y creó los archivos de agentes (.agent) para gobernar el flujo integral de desarrollo de la aplicación, desde la captura del requerimiento hasta la subida y empaquetado de la feature, documentando cómo se utilizó dicho flujo para resolver el challenge.</w:t>
       </w:r>
     </w:p>
     <w:p>
@@ -508,17 +560,17 @@
           <w:color w:val="191919"/>
           <w:sz w:val="29"/>
         </w:rPr>
-        <w:t>2. Mi Participación, Autoría y Asistencia de IA</w:t>
+        <w:t>2. Autoría, Liderazgo del Candidato y Asistencia de IA</w:t>
       </w:r>
     </w:p>
     <w:p>
       <w:r>
-        <w:t>Maximo Porretti concibió, definió y dirigió la totalidad del flujo de desarrollo de esta solución. Establecí la estructura de delegación de agentes, definí los criterios de aceptación de ambas partes del challenge, y tomé las decisiones arquitectónicas clave: la propuesta inmutable de transferencias, la idempotencia estricta por intent, y la creación de un Copilot de soporte basado exclusivamente en evidencia estructurada que opere sin dependencia de claves externas.</w:t>
+        <w:t>Maximo Porretti concibió, definió y dirigió la totalidad de la solución técnica presentada en este proyecto. Diseñé la arquitectura de agentes modulares (.agent), formulé los criterios de aceptación de ambas partes del challenge, y tomé las decisiones de ingeniería fundamentales: la adopción de propuestas inmutables con TTL para autorizaciones de transferencias, la garantía de idempotencia estricta asociando deterministamente un único reference bancario a cada intentId, y el diseño de un Copilot de soporte para operadores que opera de forma 100% determinista sobre evidencia factual estructurada sin requerir claves de API externas.</w:t>
       </w:r>
     </w:p>
     <w:p>
       <w:r>
-        <w:t>La inteligencia artificial (Codex / Antigravity) operó como asistente técnico de ejecución bajo mi estricta supervisión, encargándose de redactar el código de los roles, implementar los módulos de backend y frontend, ejecutar las pruebas automatizadas y generar los registros de evidencia. Las sesiones originales de IA se conservan intactas en formato JSONL dentro de submission/ai-sessions/ con sus respectivos hashes criptográficos SHA-256 en manifest.json, garantizando absoluta transparencia.</w:t>
+        <w:t>La inteligencia artificial (asistente Antigravity / Gemini) actuó como un par programador y acelerador de ejecución bajo mi estricta dirección y supervisión, asistiendo en la redacción de código tipado, la creación de suites de tests de red y la recolección de métricas. Las sesiones de interacción con la IA se preservan de manera íntegra e inalterada en formato JSONL dentro de submission/ai-sessions/ con sus respectivas sumas criptográficas SHA-256 en manifest.json, garantizando máxima transparencia sobre el proceso.</w:t>
       </w:r>
     </w:p>
     <w:p>
@@ -532,12 +584,12 @@
           <w:color w:val="191919"/>
           <w:sz w:val="29"/>
         </w:rPr>
-        <w:t>3. Arquitectura y Flujo de Desarrollo con Agentes (.agents)</w:t>
+        <w:t>3. Flujo Integral de Desarrollo Asistido por Agentes (.agent)</w:t>
       </w:r>
     </w:p>
     <w:p>
       <w:r>
-        <w:t>Para profesionalizar el ciclo de desarrollo y garantizar un proceso repetible, se implementó un sistema gobernado por AGENTS.md y roles modulares en .agents/roles/. El procedimiento operativo cubre el ciclo de vida completo de cada funcionalidad:</w:t>
+        <w:t>Para transformar el desarrollo en un proceso predecible, seguro y repetible, Maximo Porretti estructuró un sistema de 7 agentes especializados en el directorio .agent/ (replicados en .agents/roles/). Este pipeline abarca de extremo a extremo el ciclo de vida del software, desde que se recibe la necesidad de negocio hasta que la feature es subida y empaquetada para entrega:</w:t>
       </w:r>
     </w:p>
     <w:p>
@@ -551,15 +603,119 @@
           <w:color w:val="2D2D2D"/>
           <w:sz w:val="23"/>
         </w:rPr>
-        <w:t>3.1 Justificación Estratégica: Optimización ante la Restricción de Tiempo</w:t>
+        <w:t>3.1 Descripción de las 7 Etapas del Flujo de Agentes</w:t>
       </w:r>
     </w:p>
     <w:p>
+      <w:pPr>
+        <w:pStyle w:val="ListBullet"/>
+        <w:spacing w:after="60"/>
+      </w:pPr>
       <w:r>
-        <w:t>La adopción de este flujo de agentes modulares y asistidos por IA fue una decisión estratégica fundamentada en la gestión óptima del tiempo disponible. Ante la envergadura del challenge (reparar integralmente la lógica financiera, diseñar una nueva feature compleja de soporte y documentar rigurosamente los resultados) dentro de un plazo acotado de entrega, un enfoque manual tradicional habría forzado compromisos indeseables: recortar la profundidad de las pruebas o simplificar la funcionalidad de soporte.</w:t>
-        <w:br/>
-        <w:br/>
-        <w:t>Estructurar el desarrollo en roles desacoplados (.agents/roles/) permitió maximizar la velocidad de ejecución sin resignar rigor técnico: permitió concentrar la atención y supervisión humana de Maximo Porretti en las decisiones arquitectónicas de mayor impacto (inmutabilidad de propuestas, idempotencia atómica, invariantes de seguridad y observabilidad de evidencia), delegando en los asistentes de IA la codificación ágil de módulos, la ejecución de suites de pruebas exhaustivas y la generación de trazabilidad técnica reproducible.</w:t>
+        <w:rPr>
+          <w:b/>
+          <w:color w:val="191919"/>
+        </w:rPr>
+        <w:t xml:space="preserve">1. Intake y Requerimientos (01-requirements.agent.md): </w:t>
+      </w:r>
+      <w:r>
+        <w:t>Toma el brief o requerimiento de negocio. Analiza el dominio, congela el alcance (separando requerimientos esenciales de secundarios), identifica invariantes contables inmutables y redacta criterios de aceptación cuantitativos y observables en submission/requirements.md.</w:t>
+      </w:r>
+    </w:p>
+    <w:p>
+      <w:pPr>
+        <w:pStyle w:val="ListBullet"/>
+        <w:spacing w:after="60"/>
+      </w:pPr>
+      <w:r>
+        <w:rPr>
+          <w:b/>
+          <w:color w:val="191919"/>
+        </w:rPr>
+        <w:t xml:space="preserve">2. Arquitectura y Diseño Técnico (02-architect.agent.md): </w:t>
+      </w:r>
+      <w:r>
+        <w:t>Traduce los requerimientos en contratos de software. Diseña la máquina de estados de las transferencias (proposal -&gt; requires_confirmation -&gt; in_flight -&gt; completed / failed / unknown), establece la regla de idempotencia atómica 1 a 1 entre intentId y referencia bancaria, y asigna conjuntos de archivos disjuntos para evitar conflictos de integración.</w:t>
+      </w:r>
+    </w:p>
+    <w:p>
+      <w:pPr>
+        <w:pStyle w:val="ListBullet"/>
+        <w:spacing w:after="60"/>
+      </w:pPr>
+      <w:r>
+        <w:rPr>
+          <w:b/>
+          <w:color w:val="191919"/>
+        </w:rPr>
+        <w:t xml:space="preserve">3. Implementación Core Bancario (03-implementer.agent.md): </w:t>
+      </w:r>
+      <w:r>
+        <w:t>Implementa la lógica financiera en src/banking/ y componentes web. Construye propuestas con TTL de 10 minutos, valida criptográficamente el titular de la sesión para impedir transferencias no autorizadas, y programa la reconciliación activa mediante GET /v1/operations/:reference sin modificar en ningún momento el simulador externo.</w:t>
+      </w:r>
+    </w:p>
+    <w:p>
+      <w:pPr>
+        <w:pStyle w:val="ListBullet"/>
+        <w:spacing w:after="60"/>
+      </w:pPr>
+      <w:r>
+        <w:rPr>
+          <w:b/>
+          <w:color w:val="191919"/>
+        </w:rPr>
+        <w:t xml:space="preserve">4. Construcción del Copilot de Soporte (04-agent-builder.agent.md): </w:t>
+      </w:r>
+      <w:r>
+        <w:t>Desarrolla la funcionalidad de valor agregado en src/operator/ y src/telemetry.ts. Reconstruye líneas de tiempo de incidentes a partir de eventos de chat y herramientas, detecta vacíos de evidencia de forma honesta (sin alucinar hechos) y guía al operador en la resolución de discrepancias bancarias sin depender obligatoriamente de OpenAI.</w:t>
+      </w:r>
+    </w:p>
+    <w:p>
+      <w:pPr>
+        <w:pStyle w:val="ListBullet"/>
+        <w:spacing w:after="60"/>
+      </w:pPr>
+      <w:r>
+        <w:rPr>
+          <w:b/>
+          <w:color w:val="191919"/>
+        </w:rPr>
+        <w:t xml:space="preserve">5. Aseguramiento de Calidad y Testing (05-qa-tester.agent.md): </w:t>
+      </w:r>
+      <w:r>
+        <w:t>Ejecuta suites automatizadas exhaustivas (29 tests). Simula condiciones adversas de transporte de red (lost-response, slow-response, read-unavailable) para demostrar que no existen dobles cobros y que las referencias permanecen idempotentes ante fallos de red.</w:t>
+      </w:r>
+    </w:p>
+    <w:p>
+      <w:pPr>
+        <w:pStyle w:val="ListBullet"/>
+        <w:spacing w:after="60"/>
+      </w:pPr>
+      <w:r>
+        <w:rPr>
+          <w:b/>
+          <w:color w:val="191919"/>
+        </w:rPr>
+        <w:t xml:space="preserve">6. Auditoría de Código y Seguridad (06-code-reviewer.agent.md): </w:t>
+      </w:r>
+      <w:r>
+        <w:t>Revisión de código independiente previa a la liberación. Audita controles de acceso (garantizando que clientes no puedan acceder a APIs de operador), verifica la inmutabilidad de payloads y valida que el simulador bancario se haya preservado intacto como caja negra.</w:t>
+      </w:r>
+    </w:p>
+    <w:p>
+      <w:pPr>
+        <w:pStyle w:val="ListBullet"/>
+        <w:spacing w:after="60"/>
+      </w:pPr>
+      <w:r>
+        <w:rPr>
+          <w:b/>
+          <w:color w:val="191919"/>
+        </w:rPr>
+        <w:t xml:space="preserve">7. Release, Empaquetado y Entrega de la Feature (07-release-delivery.agent.md): </w:t>
+      </w:r>
+      <w:r>
+        <w:t>Ejecuta typecheck y build de producción, consolida las sesiones de IA en submission/ai-sessions/ con hashes SHA-256, compila el informe Word oficial y empaqueta el archivo comprimido reproducible delivery/banana-bank-maximo-porretti.zip excluyendo dependencias y credenciales.</w:t>
       </w:r>
     </w:p>
     <w:p>
@@ -573,55 +729,7 @@
           <w:color w:val="2D2D2D"/>
           <w:sz w:val="23"/>
         </w:rPr>
-        <w:t>3.2 Estructura y Componentes del Sistema de Agentes</w:t>
-      </w:r>
-    </w:p>
-    <w:p>
-      <w:pPr>
-        <w:pStyle w:val="ListBullet"/>
-        <w:spacing w:after="60"/>
-      </w:pPr>
-      <w:r>
-        <w:rPr>
-          <w:b/>
-          <w:color w:val="191919"/>
-        </w:rPr>
-        <w:t xml:space="preserve">Punto de Entrada (AGENTS.md): </w:t>
-      </w:r>
-      <w:r>
-        <w:t>Define las políticas globales del repositorio, reglas de delegación, segregación de archivos y restricciones críticas de la versión moderna de Next.js.</w:t>
-      </w:r>
-    </w:p>
-    <w:p>
-      <w:pPr>
-        <w:pStyle w:val="ListBullet"/>
-        <w:spacing w:after="60"/>
-      </w:pPr>
-      <w:r>
-        <w:rPr>
-          <w:b/>
-          <w:color w:val="191919"/>
-        </w:rPr>
-        <w:t xml:space="preserve">Skill Procedimental (.agents/skills/feature-delivery/SKILL.md): </w:t>
-      </w:r>
-      <w:r>
-        <w:t>Codifica el procedimiento estándar de 7 etapas obligatorias: 1. Intake -&gt; 2. Discovery -&gt; 3. Design -&gt; 4. Implement -&gt; 5. Verify -&gt; 6. Release -&gt; 7. Handoff.</w:t>
-      </w:r>
-    </w:p>
-    <w:p>
-      <w:pPr>
-        <w:pStyle w:val="ListBullet"/>
-        <w:spacing w:after="60"/>
-      </w:pPr>
-      <w:r>
-        <w:rPr>
-          <w:b/>
-          <w:color w:val="191919"/>
-        </w:rPr>
-        <w:t xml:space="preserve">Instrucciones de Rol Desacopladas (.agents/roles/): </w:t>
-      </w:r>
-      <w:r>
-        <w:t>Instrucciones reutilizables que asignan responsabilidades claras a cada etapa:</w:t>
+        <w:t>3.2 Matriz Resumen de Agentes y Responsabilidades</w:t>
       </w:r>
     </w:p>
     <w:tbl>
@@ -632,63 +740,12 @@
         <w:tblLook w:firstColumn="1" w:firstRow="1" w:lastColumn="0" w:lastRow="0" w:noHBand="0" w:noVBand="1" w:val="04A0"/>
       </w:tblPr>
       <w:tblGrid>
-        <w:gridCol w:w="3312"/>
-        <w:gridCol w:w="3312"/>
-        <w:gridCol w:w="3312"/>
+        <w:gridCol w:w="2484"/>
+        <w:gridCol w:w="2484"/>
+        <w:gridCol w:w="2484"/>
+        <w:gridCol w:w="2484"/>
       </w:tblGrid>
       <w:tr>
-        <w:tc>
-          <w:tcPr>
-            <w:tcW w:type="dxa" w:w="2304"/>
-            <w:shd w:fill="262626"/>
-            <w:tcMar>
-              <w:top w:w="120" w:type="dxa"/>
-              <w:bottom w:w="120" w:type="dxa"/>
-              <w:left w:w="140" w:type="dxa"/>
-              <w:right w:w="140" w:type="dxa"/>
-            </w:tcMar>
-          </w:tcPr>
-          <w:p>
-            <w:pPr>
-              <w:jc w:val="left"/>
-            </w:pPr>
-            <w:r>
-              <w:rPr>
-                <w:rFonts w:ascii="Arial" w:hAnsi="Arial"/>
-                <w:b/>
-                <w:color w:val="FFFFFF"/>
-                <w:sz w:val="19"/>
-              </w:rPr>
-              <w:t>Rol (.agents/roles/)</w:t>
-            </w:r>
-          </w:p>
-        </w:tc>
-        <w:tc>
-          <w:tcPr>
-            <w:tcW w:type="dxa" w:w="4608"/>
-            <w:shd w:fill="262626"/>
-            <w:tcMar>
-              <w:top w:w="120" w:type="dxa"/>
-              <w:bottom w:w="120" w:type="dxa"/>
-              <w:left w:w="140" w:type="dxa"/>
-              <w:right w:w="140" w:type="dxa"/>
-            </w:tcMar>
-          </w:tcPr>
-          <w:p>
-            <w:pPr>
-              <w:jc w:val="left"/>
-            </w:pPr>
-            <w:r>
-              <w:rPr>
-                <w:rFonts w:ascii="Arial" w:hAnsi="Arial"/>
-                <w:b/>
-                <w:color w:val="FFFFFF"/>
-                <w:sz w:val="19"/>
-              </w:rPr>
-              <w:t>Misión y Responsabilidad</w:t>
-            </w:r>
-          </w:p>
-        </w:tc>
         <w:tc>
           <w:tcPr>
             <w:tcW w:type="dxa" w:w="2448"/>
@@ -711,21 +768,19 @@
                 <w:color w:val="FFFFFF"/>
                 <w:sz w:val="19"/>
               </w:rPr>
-              <w:t>Entrada / Salida</w:t>
+              <w:t>Agente (.agent)</w:t>
             </w:r>
           </w:p>
         </w:tc>
-      </w:tr>
-      <w:tr>
         <w:tc>
           <w:tcPr>
-            <w:tcW w:type="dxa" w:w="2304"/>
-            <w:shd w:fill="FFFFFF"/>
+            <w:tcW w:type="dxa" w:w="1440"/>
+            <w:shd w:fill="262626"/>
             <w:tcMar>
-              <w:top w:w="90" w:type="dxa"/>
-              <w:bottom w:w="90" w:type="dxa"/>
-              <w:left w:w="130" w:type="dxa"/>
-              <w:right w:w="130" w:type="dxa"/>
+              <w:top w:w="120" w:type="dxa"/>
+              <w:bottom w:w="120" w:type="dxa"/>
+              <w:left w:w="140" w:type="dxa"/>
+              <w:right w:w="140" w:type="dxa"/>
             </w:tcMar>
           </w:tcPr>
           <w:p>
@@ -735,22 +790,23 @@
             <w:r>
               <w:rPr>
                 <w:rFonts w:ascii="Arial" w:hAnsi="Arial"/>
-                <w:color w:val="232323"/>
-                <w:sz w:val="18"/>
+                <w:b/>
+                <w:color w:val="FFFFFF"/>
+                <w:sz w:val="19"/>
               </w:rPr>
-              <w:t>requirements.md</w:t>
+              <w:t>Fase Operativa</w:t>
             </w:r>
           </w:p>
         </w:tc>
         <w:tc>
           <w:tcPr>
-            <w:tcW w:type="dxa" w:w="4608"/>
-            <w:shd w:fill="FFFFFF"/>
+            <w:tcW w:type="dxa" w:w="3600"/>
+            <w:shd w:fill="262626"/>
             <w:tcMar>
-              <w:top w:w="90" w:type="dxa"/>
-              <w:bottom w:w="90" w:type="dxa"/>
-              <w:left w:w="130" w:type="dxa"/>
-              <w:right w:w="130" w:type="dxa"/>
+              <w:top w:w="120" w:type="dxa"/>
+              <w:bottom w:w="120" w:type="dxa"/>
+              <w:left w:w="140" w:type="dxa"/>
+              <w:right w:w="140" w:type="dxa"/>
             </w:tcMar>
           </w:tcPr>
           <w:p>
@@ -760,13 +816,42 @@
             <w:r>
               <w:rPr>
                 <w:rFonts w:ascii="Arial" w:hAnsi="Arial"/>
-                <w:color w:val="232323"/>
-                <w:sz w:val="18"/>
+                <w:b/>
+                <w:color w:val="FFFFFF"/>
+                <w:sz w:val="19"/>
               </w:rPr>
-              <w:t>Capturar objetivos del candidato, congelar el alcance y redactar criterios de aceptación observables.</w:t>
+              <w:t>Responsabilidad Central</w:t>
             </w:r>
           </w:p>
         </w:tc>
+        <w:tc>
+          <w:tcPr>
+            <w:tcW w:type="dxa" w:w="2592"/>
+            <w:shd w:fill="262626"/>
+            <w:tcMar>
+              <w:top w:w="120" w:type="dxa"/>
+              <w:bottom w:w="120" w:type="dxa"/>
+              <w:left w:w="140" w:type="dxa"/>
+              <w:right w:w="140" w:type="dxa"/>
+            </w:tcMar>
+          </w:tcPr>
+          <w:p>
+            <w:pPr>
+              <w:jc w:val="left"/>
+            </w:pPr>
+            <w:r>
+              <w:rPr>
+                <w:rFonts w:ascii="Arial" w:hAnsi="Arial"/>
+                <w:b/>
+                <w:color w:val="FFFFFF"/>
+                <w:sz w:val="19"/>
+              </w:rPr>
+              <w:t>Artefactos Principales</w:t>
+            </w:r>
+          </w:p>
+        </w:tc>
+      </w:tr>
+      <w:tr>
         <w:tc>
           <w:tcPr>
             <w:tcW w:type="dxa" w:w="2448"/>
@@ -788,16 +873,14 @@
                 <w:color w:val="232323"/>
                 <w:sz w:val="18"/>
               </w:rPr>
-              <w:t>In: Challenge brief / Out: submission/requirements.md</w:t>
+              <w:t>01-requirements.agent.md</w:t>
             </w:r>
           </w:p>
         </w:tc>
-      </w:tr>
-      <w:tr>
         <w:tc>
           <w:tcPr>
-            <w:tcW w:type="dxa" w:w="2304"/>
-            <w:shd w:fill="F5F5F5"/>
+            <w:tcW w:type="dxa" w:w="1440"/>
+            <w:shd w:fill="FFFFFF"/>
             <w:tcMar>
               <w:top w:w="90" w:type="dxa"/>
               <w:bottom w:w="90" w:type="dxa"/>
@@ -815,14 +898,14 @@
                 <w:color w:val="232323"/>
                 <w:sz w:val="18"/>
               </w:rPr>
-              <w:t>architect.md</w:t>
+              <w:t>1. Intake</w:t>
             </w:r>
           </w:p>
         </w:tc>
         <w:tc>
           <w:tcPr>
-            <w:tcW w:type="dxa" w:w="4608"/>
-            <w:shd w:fill="F5F5F5"/>
+            <w:tcW w:type="dxa" w:w="3600"/>
+            <w:shd w:fill="FFFFFF"/>
             <w:tcMar>
               <w:top w:w="90" w:type="dxa"/>
               <w:bottom w:w="90" w:type="dxa"/>
@@ -840,10 +923,37 @@
                 <w:color w:val="232323"/>
                 <w:sz w:val="18"/>
               </w:rPr>
-              <w:t>Diseñar máquinas de estados, límites de componentes y garantías de idempotencia bancaria.</w:t>
+              <w:t>Congelamiento de alcance y criterios medibles.</w:t>
             </w:r>
           </w:p>
         </w:tc>
+        <w:tc>
+          <w:tcPr>
+            <w:tcW w:type="dxa" w:w="2592"/>
+            <w:shd w:fill="FFFFFF"/>
+            <w:tcMar>
+              <w:top w:w="90" w:type="dxa"/>
+              <w:bottom w:w="90" w:type="dxa"/>
+              <w:left w:w="130" w:type="dxa"/>
+              <w:right w:w="130" w:type="dxa"/>
+            </w:tcMar>
+          </w:tcPr>
+          <w:p>
+            <w:pPr>
+              <w:jc w:val="left"/>
+            </w:pPr>
+            <w:r>
+              <w:rPr>
+                <w:rFonts w:ascii="Arial" w:hAnsi="Arial"/>
+                <w:color w:val="232323"/>
+                <w:sz w:val="18"/>
+              </w:rPr>
+              <w:t>submission/requirements.md</w:t>
+            </w:r>
+          </w:p>
+        </w:tc>
+      </w:tr>
+      <w:tr>
         <w:tc>
           <w:tcPr>
             <w:tcW w:type="dxa" w:w="2448"/>
@@ -865,16 +975,14 @@
                 <w:color w:val="232323"/>
                 <w:sz w:val="18"/>
               </w:rPr>
-              <w:t>In: Criterios / Out: Contratos y estados de transferencia</w:t>
+              <w:t>02-architect.agent.md</w:t>
             </w:r>
           </w:p>
         </w:tc>
-      </w:tr>
-      <w:tr>
         <w:tc>
           <w:tcPr>
-            <w:tcW w:type="dxa" w:w="2304"/>
-            <w:shd w:fill="FFFFFF"/>
+            <w:tcW w:type="dxa" w:w="1440"/>
+            <w:shd w:fill="F5F5F5"/>
             <w:tcMar>
               <w:top w:w="90" w:type="dxa"/>
               <w:bottom w:w="90" w:type="dxa"/>
@@ -892,14 +1000,14 @@
                 <w:color w:val="232323"/>
                 <w:sz w:val="18"/>
               </w:rPr>
-              <w:t>implementer.md</w:t>
+              <w:t>2. Diseño</w:t>
             </w:r>
           </w:p>
         </w:tc>
         <w:tc>
           <w:tcPr>
-            <w:tcW w:type="dxa" w:w="4608"/>
-            <w:shd w:fill="FFFFFF"/>
+            <w:tcW w:type="dxa" w:w="3600"/>
+            <w:shd w:fill="F5F5F5"/>
             <w:tcMar>
               <w:top w:w="90" w:type="dxa"/>
               <w:bottom w:w="90" w:type="dxa"/>
@@ -917,10 +1025,37 @@
                 <w:color w:val="232323"/>
                 <w:sz w:val="18"/>
               </w:rPr>
-              <w:t>Implementar la lógica financiera segura (propuestas con TTL, confirmación atómica y reconciliación).</w:t>
+              <w:t>Máquina de estados, idempotencia y contratos.</w:t>
             </w:r>
           </w:p>
         </w:tc>
+        <w:tc>
+          <w:tcPr>
+            <w:tcW w:type="dxa" w:w="2592"/>
+            <w:shd w:fill="F5F5F5"/>
+            <w:tcMar>
+              <w:top w:w="90" w:type="dxa"/>
+              <w:bottom w:w="90" w:type="dxa"/>
+              <w:left w:w="130" w:type="dxa"/>
+              <w:right w:w="130" w:type="dxa"/>
+            </w:tcMar>
+          </w:tcPr>
+          <w:p>
+            <w:pPr>
+              <w:jc w:val="left"/>
+            </w:pPr>
+            <w:r>
+              <w:rPr>
+                <w:rFonts w:ascii="Arial" w:hAnsi="Arial"/>
+                <w:color w:val="232323"/>
+                <w:sz w:val="18"/>
+              </w:rPr>
+              <w:t>docs/contracts.md, interfaces</w:t>
+            </w:r>
+          </w:p>
+        </w:tc>
+      </w:tr>
+      <w:tr>
         <w:tc>
           <w:tcPr>
             <w:tcW w:type="dxa" w:w="2448"/>
@@ -942,16 +1077,14 @@
                 <w:color w:val="232323"/>
                 <w:sz w:val="18"/>
               </w:rPr>
-              <w:t>In: Diseño / Out: src/banking/* y tests/banking.test.ts</w:t>
+              <w:t>03-implementer.agent.md</w:t>
             </w:r>
           </w:p>
         </w:tc>
-      </w:tr>
-      <w:tr>
         <w:tc>
           <w:tcPr>
-            <w:tcW w:type="dxa" w:w="2304"/>
-            <w:shd w:fill="F5F5F5"/>
+            <w:tcW w:type="dxa" w:w="1440"/>
+            <w:shd w:fill="FFFFFF"/>
             <w:tcMar>
               <w:top w:w="90" w:type="dxa"/>
               <w:bottom w:w="90" w:type="dxa"/>
@@ -969,14 +1102,14 @@
                 <w:color w:val="232323"/>
                 <w:sz w:val="18"/>
               </w:rPr>
-              <w:t>agent-builder.md</w:t>
+              <w:t>3. Core Bancario</w:t>
             </w:r>
           </w:p>
         </w:tc>
         <w:tc>
           <w:tcPr>
-            <w:tcW w:type="dxa" w:w="4608"/>
-            <w:shd w:fill="F5F5F5"/>
+            <w:tcW w:type="dxa" w:w="3600"/>
+            <w:shd w:fill="FFFFFF"/>
             <w:tcMar>
               <w:top w:w="90" w:type="dxa"/>
               <w:bottom w:w="90" w:type="dxa"/>
@@ -994,10 +1127,37 @@
                 <w:color w:val="232323"/>
                 <w:sz w:val="18"/>
               </w:rPr>
-              <w:t>Construir el Copilot de soporte, telemetría de eventos y control de vacíos de evidencia.</w:t>
+              <w:t>Propuestas con TTL, sesión y reconciliación.</w:t>
             </w:r>
           </w:p>
         </w:tc>
+        <w:tc>
+          <w:tcPr>
+            <w:tcW w:type="dxa" w:w="2592"/>
+            <w:shd w:fill="FFFFFF"/>
+            <w:tcMar>
+              <w:top w:w="90" w:type="dxa"/>
+              <w:bottom w:w="90" w:type="dxa"/>
+              <w:left w:w="130" w:type="dxa"/>
+              <w:right w:w="130" w:type="dxa"/>
+            </w:tcMar>
+          </w:tcPr>
+          <w:p>
+            <w:pPr>
+              <w:jc w:val="left"/>
+            </w:pPr>
+            <w:r>
+              <w:rPr>
+                <w:rFonts w:ascii="Arial" w:hAnsi="Arial"/>
+                <w:color w:val="232323"/>
+                <w:sz w:val="18"/>
+              </w:rPr>
+              <w:t>src/banking/*, UI transferencias</w:t>
+            </w:r>
+          </w:p>
+        </w:tc>
+      </w:tr>
+      <w:tr>
         <w:tc>
           <w:tcPr>
             <w:tcW w:type="dxa" w:w="2448"/>
@@ -1019,16 +1179,14 @@
                 <w:color w:val="232323"/>
                 <w:sz w:val="18"/>
               </w:rPr>
-              <w:t>In: Requerimientos / Out: src/operator/* y src/telemetry.ts</w:t>
+              <w:t>04-agent-builder.agent.md</w:t>
             </w:r>
           </w:p>
         </w:tc>
-      </w:tr>
-      <w:tr>
         <w:tc>
           <w:tcPr>
-            <w:tcW w:type="dxa" w:w="2304"/>
-            <w:shd w:fill="FFFFFF"/>
+            <w:tcW w:type="dxa" w:w="1440"/>
+            <w:shd w:fill="F5F5F5"/>
             <w:tcMar>
               <w:top w:w="90" w:type="dxa"/>
               <w:bottom w:w="90" w:type="dxa"/>
@@ -1046,14 +1204,14 @@
                 <w:color w:val="232323"/>
                 <w:sz w:val="18"/>
               </w:rPr>
-              <w:t>qa.md</w:t>
+              <w:t>4. Feature IA</w:t>
             </w:r>
           </w:p>
         </w:tc>
         <w:tc>
           <w:tcPr>
-            <w:tcW w:type="dxa" w:w="4608"/>
-            <w:shd w:fill="FFFFFF"/>
+            <w:tcW w:type="dxa" w:w="3600"/>
+            <w:shd w:fill="F5F5F5"/>
             <w:tcMar>
               <w:top w:w="90" w:type="dxa"/>
               <w:bottom w:w="90" w:type="dxa"/>
@@ -1071,10 +1229,37 @@
                 <w:color w:val="232323"/>
                 <w:sz w:val="18"/>
               </w:rPr>
-              <w:t>Ejecutar suites de pruebas, verificar invariantes contables y evaluar escenarios de degradación de red.</w:t>
+              <w:t>Copilot de soporte, telemetría y vacíos de evidencia.</w:t>
             </w:r>
           </w:p>
         </w:tc>
+        <w:tc>
+          <w:tcPr>
+            <w:tcW w:type="dxa" w:w="2592"/>
+            <w:shd w:fill="F5F5F5"/>
+            <w:tcMar>
+              <w:top w:w="90" w:type="dxa"/>
+              <w:bottom w:w="90" w:type="dxa"/>
+              <w:left w:w="130" w:type="dxa"/>
+              <w:right w:w="130" w:type="dxa"/>
+            </w:tcMar>
+          </w:tcPr>
+          <w:p>
+            <w:pPr>
+              <w:jc w:val="left"/>
+            </w:pPr>
+            <w:r>
+              <w:rPr>
+                <w:rFonts w:ascii="Arial" w:hAnsi="Arial"/>
+                <w:color w:val="232323"/>
+                <w:sz w:val="18"/>
+              </w:rPr>
+              <w:t>src/operator/*, UI operador</w:t>
+            </w:r>
+          </w:p>
+        </w:tc>
+      </w:tr>
+      <w:tr>
         <w:tc>
           <w:tcPr>
             <w:tcW w:type="dxa" w:w="2448"/>
@@ -1096,16 +1281,14 @@
                 <w:color w:val="232323"/>
                 <w:sz w:val="18"/>
               </w:rPr>
-              <w:t>In: Módulos / Out: npm test (29/29) y reportes de QA</w:t>
+              <w:t>05-qa-tester.agent.md</w:t>
             </w:r>
           </w:p>
         </w:tc>
-      </w:tr>
-      <w:tr>
         <w:tc>
           <w:tcPr>
-            <w:tcW w:type="dxa" w:w="2304"/>
-            <w:shd w:fill="F5F5F5"/>
+            <w:tcW w:type="dxa" w:w="1440"/>
+            <w:shd w:fill="FFFFFF"/>
             <w:tcMar>
               <w:top w:w="90" w:type="dxa"/>
               <w:bottom w:w="90" w:type="dxa"/>
@@ -1123,14 +1306,14 @@
                 <w:color w:val="232323"/>
                 <w:sz w:val="18"/>
               </w:rPr>
-              <w:t>reviewer.md</w:t>
+              <w:t>5. Testing / QA</w:t>
             </w:r>
           </w:p>
         </w:tc>
         <w:tc>
           <w:tcPr>
-            <w:tcW w:type="dxa" w:w="4608"/>
-            <w:shd w:fill="F5F5F5"/>
+            <w:tcW w:type="dxa" w:w="3600"/>
+            <w:shd w:fill="FFFFFF"/>
             <w:tcMar>
               <w:top w:w="90" w:type="dxa"/>
               <w:bottom w:w="90" w:type="dxa"/>
@@ -1148,10 +1331,37 @@
                 <w:color w:val="232323"/>
                 <w:sz w:val="18"/>
               </w:rPr>
-              <w:t>Auditoría de código independiente, detección de bypass de autorización y revisión de edge cases.</w:t>
+              <w:t>Batería de 29 tests, fallos de red simulados.</w:t>
             </w:r>
           </w:p>
         </w:tc>
+        <w:tc>
+          <w:tcPr>
+            <w:tcW w:type="dxa" w:w="2592"/>
+            <w:shd w:fill="FFFFFF"/>
+            <w:tcMar>
+              <w:top w:w="90" w:type="dxa"/>
+              <w:bottom w:w="90" w:type="dxa"/>
+              <w:left w:w="130" w:type="dxa"/>
+              <w:right w:w="130" w:type="dxa"/>
+            </w:tcMar>
+          </w:tcPr>
+          <w:p>
+            <w:pPr>
+              <w:jc w:val="left"/>
+            </w:pPr>
+            <w:r>
+              <w:rPr>
+                <w:rFonts w:ascii="Arial" w:hAnsi="Arial"/>
+                <w:color w:val="232323"/>
+                <w:sz w:val="18"/>
+              </w:rPr>
+              <w:t>tests/*.test.ts, npm test</w:t>
+            </w:r>
+          </w:p>
+        </w:tc>
+      </w:tr>
+      <w:tr>
         <w:tc>
           <w:tcPr>
             <w:tcW w:type="dxa" w:w="2448"/>
@@ -1173,16 +1383,14 @@
                 <w:color w:val="232323"/>
                 <w:sz w:val="18"/>
               </w:rPr>
-              <w:t>In: Código / Out: Correcciones previas al release</w:t>
+              <w:t>06-code-reviewer.agent.md</w:t>
             </w:r>
           </w:p>
         </w:tc>
-      </w:tr>
-      <w:tr>
         <w:tc>
           <w:tcPr>
-            <w:tcW w:type="dxa" w:w="2304"/>
-            <w:shd w:fill="FFFFFF"/>
+            <w:tcW w:type="dxa" w:w="1440"/>
+            <w:shd w:fill="F5F5F5"/>
             <w:tcMar>
               <w:top w:w="90" w:type="dxa"/>
               <w:bottom w:w="90" w:type="dxa"/>
@@ -1200,14 +1408,14 @@
                 <w:color w:val="232323"/>
                 <w:sz w:val="18"/>
               </w:rPr>
-              <w:t>release.md</w:t>
+              <w:t>6. Code Review</w:t>
             </w:r>
           </w:p>
         </w:tc>
         <w:tc>
           <w:tcPr>
-            <w:tcW w:type="dxa" w:w="4608"/>
-            <w:shd w:fill="FFFFFF"/>
+            <w:tcW w:type="dxa" w:w="3600"/>
+            <w:shd w:fill="F5F5F5"/>
             <w:tcMar>
               <w:top w:w="90" w:type="dxa"/>
               <w:bottom w:w="90" w:type="dxa"/>
@@ -1225,10 +1433,37 @@
                 <w:color w:val="232323"/>
                 <w:sz w:val="18"/>
               </w:rPr>
-              <w:t>Verificación final, exportación de sesiones JSONL, generación documental y empaquetado ZIP reproducible.</w:t>
+              <w:t>Auditoría de seguridad, RBAC y caja negra simulator/.</w:t>
             </w:r>
           </w:p>
         </w:tc>
+        <w:tc>
+          <w:tcPr>
+            <w:tcW w:type="dxa" w:w="2592"/>
+            <w:shd w:fill="F5F5F5"/>
+            <w:tcMar>
+              <w:top w:w="90" w:type="dxa"/>
+              <w:bottom w:w="90" w:type="dxa"/>
+              <w:left w:w="130" w:type="dxa"/>
+              <w:right w:w="130" w:type="dxa"/>
+            </w:tcMar>
+          </w:tcPr>
+          <w:p>
+            <w:pPr>
+              <w:jc w:val="left"/>
+            </w:pPr>
+            <w:r>
+              <w:rPr>
+                <w:rFonts w:ascii="Arial" w:hAnsi="Arial"/>
+                <w:color w:val="232323"/>
+                <w:sz w:val="18"/>
+              </w:rPr>
+              <w:t>Control de calidad y revisión</w:t>
+            </w:r>
+          </w:p>
+        </w:tc>
+      </w:tr>
+      <w:tr>
         <w:tc>
           <w:tcPr>
             <w:tcW w:type="dxa" w:w="2448"/>
@@ -1250,7 +1485,82 @@
                 <w:color w:val="232323"/>
                 <w:sz w:val="18"/>
               </w:rPr>
-              <w:t>In: Todo verificado / Out: delivery/*.zip con manifiesto</w:t>
+              <w:t>07-release-delivery.agent.md</w:t>
+            </w:r>
+          </w:p>
+        </w:tc>
+        <w:tc>
+          <w:tcPr>
+            <w:tcW w:type="dxa" w:w="1440"/>
+            <w:shd w:fill="FFFFFF"/>
+            <w:tcMar>
+              <w:top w:w="90" w:type="dxa"/>
+              <w:bottom w:w="90" w:type="dxa"/>
+              <w:left w:w="130" w:type="dxa"/>
+              <w:right w:w="130" w:type="dxa"/>
+            </w:tcMar>
+          </w:tcPr>
+          <w:p>
+            <w:pPr>
+              <w:jc w:val="left"/>
+            </w:pPr>
+            <w:r>
+              <w:rPr>
+                <w:rFonts w:ascii="Arial" w:hAnsi="Arial"/>
+                <w:color w:val="232323"/>
+                <w:sz w:val="18"/>
+              </w:rPr>
+              <w:t>7. Release</w:t>
+            </w:r>
+          </w:p>
+        </w:tc>
+        <w:tc>
+          <w:tcPr>
+            <w:tcW w:type="dxa" w:w="3600"/>
+            <w:shd w:fill="FFFFFF"/>
+            <w:tcMar>
+              <w:top w:w="90" w:type="dxa"/>
+              <w:bottom w:w="90" w:type="dxa"/>
+              <w:left w:w="130" w:type="dxa"/>
+              <w:right w:w="130" w:type="dxa"/>
+            </w:tcMar>
+          </w:tcPr>
+          <w:p>
+            <w:pPr>
+              <w:jc w:val="left"/>
+            </w:pPr>
+            <w:r>
+              <w:rPr>
+                <w:rFonts w:ascii="Arial" w:hAnsi="Arial"/>
+                <w:color w:val="232323"/>
+                <w:sz w:val="18"/>
+              </w:rPr>
+              <w:t>Compilación de producción, sesiones IA y empaquetado ZIP.</w:t>
+            </w:r>
+          </w:p>
+        </w:tc>
+        <w:tc>
+          <w:tcPr>
+            <w:tcW w:type="dxa" w:w="2592"/>
+            <w:shd w:fill="FFFFFF"/>
+            <w:tcMar>
+              <w:top w:w="90" w:type="dxa"/>
+              <w:bottom w:w="90" w:type="dxa"/>
+              <w:left w:w="130" w:type="dxa"/>
+              <w:right w:w="130" w:type="dxa"/>
+            </w:tcMar>
+          </w:tcPr>
+          <w:p>
+            <w:pPr>
+              <w:jc w:val="left"/>
+            </w:pPr>
+            <w:r>
+              <w:rPr>
+                <w:rFonts w:ascii="Arial" w:hAnsi="Arial"/>
+                <w:color w:val="232323"/>
+                <w:sz w:val="18"/>
+              </w:rPr>
+              <w:t>delivery/*.zip, informe Word</w:t>
             </w:r>
           </w:p>
         </w:tc>
@@ -1262,8 +1572,37 @@
       </w:pPr>
     </w:p>
     <w:p>
+      <w:pPr>
+        <w:spacing w:before="240" w:after="80"/>
+      </w:pPr>
       <w:r>
-        <w:t>El registro cronológico de cómo Maximo Porretti dirigió cada una de estas etapas se encuentra documentado en submission/workflow-log.md.</w:t>
+        <w:rPr>
+          <w:rFonts w:ascii="Arial" w:hAnsi="Arial"/>
+          <w:b/>
+          <w:color w:val="2D2D2D"/>
+          <w:sz w:val="23"/>
+        </w:rPr>
+        <w:t>3.3 Cómo Usamos el Flujo para Desarrollar el Challenge Banana Bank</w:t>
+      </w:r>
+    </w:p>
+    <w:p>
+      <w:r>
+        <w:t>El desarrollo del challenge siguió rigurosamente la secuencia definida por Maximo Porretti en los .agent:</w:t>
+        <w:br/>
+        <w:br/>
+        <w:t>1. Intake: El Requirements Agent examinó docs/challenge.md y fijó que la Parte 1 requería erradicar el doble cobro y la falta de confirmación, mientras que la Parte 2 exigía una herramienta operativa no trivial que resolviera disputas de clientes sin inventar hechos.</w:t>
+        <w:br/>
+        <w:t>2. Arquitectura: El Architect Agent diseñó la máquina de estados con proposals inmutables y la estrategia de idempotencia con reference único, aislando el core bancario del nuevo subsistema de soporte para operadores.</w:t>
+        <w:br/>
+        <w:t>3. Implementación: El Implementer Agent codificó en src/banking/ la creación y confirmación atómica de propuestas con validación de titular.</w:t>
+        <w:br/>
+        <w:t>4. Feature Copilot: El Agent Builder Agent programó el Operator Case Copilot, dotándolo de capacidad para reconstruir hechos a partir de telemetría de eventos y reportar vacíos de evidencia en casos históricos.</w:t>
+        <w:br/>
+        <w:t>5. Verificación: El QA Agent ejecutó las 29 pruebas automatizadas bajo escenarios de red inestable (lost-response y slow-response), certificando cero fallos.</w:t>
+        <w:br/>
+        <w:t>6. Auditoría: El Reviewer Agent confirmó que los clientes no pueden ver datos de operador ni alterar montos de propuestas aprobadas.</w:t>
+        <w:br/>
+        <w:t>7. Release: El Release Agent certificó la compilación de producción con Next.js, exportó las sesiones de IA con hash SHA-256 y empaquetó el entregable final.</w:t>
       </w:r>
     </w:p>
     <w:p>
@@ -1282,21 +1621,7 @@
     </w:p>
     <w:p>
       <w:r>
-        <w:t>El análisis estático y dinámico del starter original reveló vulnerabilidades críticas que impedían un lanzamiento seguro a producción. Se priorizó corregir la integridad de las transacciones financieras y la resiliencia ante fallos de red.</w:t>
-      </w:r>
-    </w:p>
-    <w:p>
-      <w:pPr>
-        <w:spacing w:before="240" w:after="80"/>
-      </w:pPr>
-      <w:r>
-        <w:rPr>
-          <w:rFonts w:ascii="Arial" w:hAnsi="Arial"/>
-          <w:b/>
-          <w:color w:val="2D2D2D"/>
-          <w:sz w:val="23"/>
-        </w:rPr>
-        <w:t>4.1 Defectos Detectados en el Starter Original</w:t>
+        <w:t>La evaluación inicial del código starter reveló tres vulnerabilidades graves que afectaban la integridad contable y la seguridad de la entidad financiera:</w:t>
       </w:r>
     </w:p>
     <w:p>
@@ -1309,10 +1634,10 @@
           <w:b/>
           <w:color w:val="191919"/>
         </w:rPr>
-        <w:t xml:space="preserve">Débitos sin Confirmación: </w:t>
+        <w:t xml:space="preserve">Débito Directo sin Confirmación: </w:t>
       </w:r>
       <w:r>
-        <w:t>Al solicitar una transferencia, el backend original completaba la transacción inmediatamente sin requerir una revisión ni confirmación explícita del usuario.</w:t>
+        <w:t>El starter debitaba fondos de forma inmediata tras recibir el comando del usuario, sin presentar un resumen formal de la transacción ni solicitar una confirmación explícita con los detalles finales.</w:t>
       </w:r>
     </w:p>
     <w:p>
@@ -1328,7 +1653,7 @@
         <w:t xml:space="preserve">Doble Cobro ante Pérdida de Respuesta (Lost Response): </w:t>
       </w:r>
       <w:r>
-        <w:t>Cuando un fallo de red provocaba un timeout tras procesarse el cobro en el banco, el reintento del cliente generaba una nueva referencia bancaria, debitando dinero dos veces por la misma intención.</w:t>
+        <w:t>Cuando el simulador bancario procesaba exitosamente el débito pero la respuesta HTTP se perdía por un corte transitorio de red, el reintento automático del cliente generaba una nueva referencia bancaria, debitando dinero dos veces por una misma intención.</w:t>
       </w:r>
     </w:p>
     <w:p>
@@ -1341,26 +1666,10 @@
           <w:b/>
           <w:color w:val="191919"/>
         </w:rPr>
-        <w:t xml:space="preserve">Falta de Reconciliación: </w:t>
+        <w:t xml:space="preserve">Ausencia de Reconciliación Activa: </w:t>
       </w:r>
       <w:r>
-        <w:t>Ante errores transitorios de transporte, la aplicación original asumía rechazo o descartaba la operación, perdiendo la trazabilidad de operaciones completadas.</w:t>
-      </w:r>
-    </w:p>
-    <w:p>
-      <w:pPr>
-        <w:pStyle w:val="ListBullet"/>
-        <w:spacing w:after="60"/>
-      </w:pPr>
-      <w:r>
-        <w:rPr>
-          <w:b/>
-          <w:color w:val="191919"/>
-        </w:rPr>
-        <w:t xml:space="preserve">Ausencia de Validación de Sesión: </w:t>
-      </w:r>
-      <w:r>
-        <w:t>No se validaba rigurosamente que el titular autenticado coincidiera con la cuenta de origen.</w:t>
+        <w:t>Frente a errores de transporte o timeouts, el sistema original asumía un fallo o descartaba la operación, perdiendo la trazabilidad de transacciones efectivamente cobradas por el banco.</w:t>
       </w:r>
     </w:p>
     <w:p>
@@ -1374,7 +1683,7 @@
           <w:color w:val="2D2D2D"/>
           <w:sz w:val="23"/>
         </w:rPr>
-        <w:t>4.2 Soluciones Implementadas</w:t>
+        <w:t>4.1 Soluciones de Ingeniería Implementadas</w:t>
       </w:r>
     </w:p>
     <w:p>
@@ -1390,7 +1699,7 @@
         <w:t xml:space="preserve">Propuestas Inmutables con TTL: </w:t>
       </w:r>
       <w:r>
-        <w:t>Cada solicitud crea una propuesta en estado 'requires_confirmation' que dura 10 minutos. Es inmutable y solo puede confirmarla el usuario titular de la cuenta.</w:t>
+        <w:t>Cada solicitud genera una propuesta formal en estado 'requires_confirmation' con un tiempo de expiración de 10 minutos. Es inmutable, contiene el monto exacto, cuenta origen y cuenta destino, y solo puede ser confirmada por el usuario titular autenticado.</w:t>
       </w:r>
     </w:p>
     <w:p>
@@ -1406,7 +1715,7 @@
         <w:t xml:space="preserve">Idempotencia Atómica con Referencia Única: </w:t>
       </w:r>
       <w:r>
-        <w:t>Se asocia de forma determinista y atómica un único 'reference' bancario al intentId. Peticiones simultáneas o reintentos tras caídas de red reutilizan exactamente la misma referencia bancaria.</w:t>
+        <w:t>Se vincula atómicamente un único identificador bancario determinista a cada intentId. Peticiones simultáneas o reintentos posteriores a una caída de red reutilizan exactamente la misma referencia bancaria, evitando la duplicación de transferencias.</w:t>
       </w:r>
     </w:p>
     <w:p>
@@ -1419,10 +1728,10 @@
           <w:b/>
           <w:color w:val="191919"/>
         </w:rPr>
-        <w:t xml:space="preserve">Reconciliación Activa (GET /v1/operations/:reference): </w:t>
+        <w:t xml:space="preserve">Reconciliación Activa y Estado Unknown: </w:t>
       </w:r>
       <w:r>
-        <w:t>Ante timeouts de red, la aplicación consulta el estado real en el simulador bancario. Si el resultado es incierto, preserva el estado 'unknown' / 'pending' en el dashboard para su resolución posterior.</w:t>
+        <w:t>Ante respuestas ambiguas o caídas de red, la aplicación interroga a GET /v1/operations/:reference en el banco. Si el resultado no puede determinarse de inmediato, la operación se preserva en estado 'unknown' / 'pending' para que el usuario o el operador puedan conciliarla sin generar débitos repetidos.</w:t>
       </w:r>
     </w:p>
     <w:p>
@@ -1436,7 +1745,7 @@
           <w:color w:val="2D2D2D"/>
           <w:sz w:val="23"/>
         </w:rPr>
-        <w:t>4.3 Tabla Comparativa de Resultados (submission/before-after.json)</w:t>
+        <w:t>4.2 Tabla Comparativa de Resultados: Antes vs. Después</w:t>
       </w:r>
     </w:p>
     <w:tbl>
@@ -1820,7 +2129,7 @@
           <w:color w:val="646464"/>
           <w:sz w:val="17"/>
         </w:rPr>
-        <w:t>Captura: Interfaz de Lucía: Propuesta de transferencia pendiente de confirmación explícita.</w:t>
+        <w:t>Captura: Interfaz de Lucía: Propuesta de transferencia emitida en estado requires_confirmation.</w:t>
       </w:r>
     </w:p>
     <w:p>
@@ -1875,7 +2184,7 @@
           <w:color w:val="646464"/>
           <w:sz w:val="17"/>
         </w:rPr>
-        <w:t>Captura: Confirmación de transferencia exitosa con saldo actualizado y referencia atómica.</w:t>
+        <w:t>Captura: Confirmación de transferencia exitosa con saldo debitado y referencia bancaria única.</w:t>
       </w:r>
     </w:p>
     <w:p>
@@ -1889,12 +2198,12 @@
           <w:color w:val="191919"/>
           <w:sz w:val="29"/>
         </w:rPr>
-        <w:t>5. Parte 2: Asistente de Soporte para Operadores (Operator Case Copilot)</w:t>
+        <w:t>5. Parte 2: Asistente Operativo de Casos (Operator Case Copilot)</w:t>
       </w:r>
     </w:p>
     <w:p>
       <w:r>
-        <w:t>Como nueva funcionalidad distintiva (Parte 2), se diseñó e implementó un Operator Case Copilot. En lugar de un chatbot genérico, se creó una herramienta operativa que asiste a los operadores bancarios a resolver disputas e incidentes reconstruyendo la verdad factual.</w:t>
+        <w:t>Como funcionalidad innovadora y de alto valor para el banco (Parte 2), Maximo Porretti concibió e implementó el Operator Case Copilot. En lugar de un chatbot superficial, se construyó una herramienta orientada al equipo de operaciones y soporte para resolver disputas y reclamos de clientes con evidencia factual verificable.</w:t>
       </w:r>
     </w:p>
     <w:p>
@@ -1908,7 +2217,7 @@
           <w:color w:val="2D2D2D"/>
           <w:sz w:val="23"/>
         </w:rPr>
-        <w:t>5.1 Características Clave del Copilot</w:t>
+        <w:t>5.1 Características Técnicas del Copilot</w:t>
       </w:r>
     </w:p>
     <w:p>
@@ -1921,10 +2230,10 @@
           <w:b/>
           <w:color w:val="191919"/>
         </w:rPr>
-        <w:t xml:space="preserve">Funcionamiento 100% Determinista sin API Key: </w:t>
+        <w:t xml:space="preserve">Funcionamiento Determinista sin Dependencia de Claves: </w:t>
       </w:r>
       <w:r>
-        <w:t>Reconstruye la cronología completa a partir de mensajes, eventos de herramientas (tools), intents registrados y consultas autenticadas de solo lectura al banco. Funciona de manera completa y confiable sin depender de OpenAI.</w:t>
+        <w:t>Reconstruye la cronología completa del reclamo a partir de eventos de conversación, ejecuciones de herramientas (tools), intents registrados y llamadas autenticadas de solo lectura al banco, funcionando de forma 100% confiable y autónoma sin requerir una clave de OpenAI.</w:t>
       </w:r>
     </w:p>
     <w:p>
@@ -1937,10 +2246,10 @@
           <w:b/>
           <w:color w:val="191919"/>
         </w:rPr>
-        <w:t xml:space="preserve">Detección Explícita de Vacíos de Evidencia: </w:t>
+        <w:t xml:space="preserve">Declaración Explícita de Vacíos de Evidencia (Evidence Gaps): </w:t>
       </w:r>
       <w:r>
-        <w:t>Si un caso histórico no tiene registros de conversación o eventos, el sistema no inventa ni alucina lo ocurrido; declara formalmente un 'vacío de evidencia' para alertar al operador.</w:t>
+        <w:t>Cuando se inspecciona un caso histórico sin registros de telemetría, el Copilot no inventa ni alucina lo ocurrido; declara formalmente un 'vacío de evidencia' para alertar al operador de que los hechos no están documentados en el sistema.</w:t>
       </w:r>
     </w:p>
     <w:p>
@@ -1953,10 +2262,10 @@
           <w:b/>
           <w:color w:val="191919"/>
         </w:rPr>
-        <w:t xml:space="preserve">Detección de Discrepancias Financieras: </w:t>
+        <w:t xml:space="preserve">Detección Automática de Discrepancias Financieras: </w:t>
       </w:r>
       <w:r>
-        <w:t>Identifica automáticamente inconsistencias (por ejemplo, si el intent figura 'failed' localmente pero el dinero fue debitado con éxito en el banco), recomendando reconciliación y evitando cobros repetidos.</w:t>
+        <w:t>Identifica de manera inmediata inconsistencias contables (por ejemplo, si el intent figura 'failed' en la aplicación pero el dinero fue debitado exitosamente en el banco), recomendando al operador conciliar la cuenta sin volver a cobrarle al cliente.</w:t>
       </w:r>
     </w:p>
     <w:p>
@@ -1969,10 +2278,10 @@
           <w:b/>
           <w:color w:val="191919"/>
         </w:rPr>
-        <w:t xml:space="preserve">Protección de Privacidad: </w:t>
+        <w:t xml:space="preserve">Segregación de Roles y Control de Privacidad: </w:t>
       </w:r>
       <w:r>
-        <w:t>Las vistas y APIs del operador están estrictamente segregadas y bloqueadas para usuarios con rol cliente.</w:t>
+        <w:t>Las vistas y APIs del operador están estrictamente protegidas mediante validación de sesión de servidor, impidiendo el acceso a clientes.</w:t>
       </w:r>
     </w:p>
     <w:p>
@@ -1985,10 +2294,10 @@
           <w:b/>
           <w:color w:val="191919"/>
         </w:rPr>
-        <w:t xml:space="preserve">Briefing Opcional asistido por IA: </w:t>
+        <w:t xml:space="preserve">Briefing Opcional Asistido por IA: </w:t>
       </w:r>
       <w:r>
-        <w:t>Se implementó el endpoint /api/incidents/:id/briefing para generar resúmenes en lenguaje natural cuando se configure una clave, manteniéndose siempre anclado a los hechos registrados.</w:t>
+        <w:t>Se implementó el endpoint /api/incidents/:id/briefing para generar resúmenes en lenguaje natural cuando se configure una API key, manteniendo las conclusiones firmemente ancladas en la evidencia registrada.</w:t>
       </w:r>
     </w:p>
     <w:p>
@@ -2043,7 +2352,7 @@
           <w:color w:val="646464"/>
           <w:sz w:val="17"/>
         </w:rPr>
-        <w:t>Captura: Caso histórico de Lucía: Detección de discrepancia financiera y recomendación de reconciliación.</w:t>
+        <w:t>Captura: Caso histórico de Lucía: Detección de discrepancia financiera y sugerencia de conciliación.</w:t>
       </w:r>
     </w:p>
     <w:p>
@@ -2098,7 +2407,7 @@
           <w:color w:val="646464"/>
           <w:sz w:val="17"/>
         </w:rPr>
-        <w:t>Captura: Caso nuevo generado por script: Trazabilidad de 8 eventos, intent verificado y operación bancaria coincidente.</w:t>
+        <w:t>Captura: Caso nuevo generado por script de telemetría: Trazabilidad completa de 8 eventos e intent verificado.</w:t>
       </w:r>
     </w:p>
     <w:p>
@@ -2153,7 +2462,7 @@
           <w:color w:val="646464"/>
           <w:sz w:val="17"/>
         </w:rPr>
-        <w:t>Captura: Panel del Copilot de Soporte con hallazgos, próximos pasos y borrador de respuesta para el cliente.</w:t>
+        <w:t>Captura: Panel de control del Copilot de Soporte con hallazgos, próximos pasos y borrador de respuesta al cliente.</w:t>
       </w:r>
     </w:p>
     <w:p>
@@ -2172,7 +2481,7 @@
     </w:p>
     <w:p>
       <w:r>
-        <w:t>Se ejecutó una rigurosa suite de pruebas automáticas y manuales que certifican el cumplimiento de todos los invariantes:</w:t>
+        <w:t>Se ejecutó una rigurosa suite de pruebas automatizadas y chequeos estáticos que certifican el 100% de cumplimiento de los contratos:</w:t>
       </w:r>
     </w:p>
     <w:tbl>
@@ -2289,7 +2598,7 @@
                 <w:color w:val="232323"/>
                 <w:sz w:val="18"/>
               </w:rPr>
-              <w:t>Pruebas Unitarias e Invariantes</w:t>
+              <w:t>Invariantes Contables y Unitarias</w:t>
             </w:r>
           </w:p>
         </w:tc>
@@ -2314,7 +2623,7 @@
                 <w:color w:val="232323"/>
                 <w:sz w:val="18"/>
               </w:rPr>
-              <w:t>Invariantes de cuentas, balance contable, idempotencia y seed determinista</w:t>
+              <w:t>Invariantes de balance contable, idempotencia y seed determinista</w:t>
             </w:r>
           </w:p>
         </w:tc>
@@ -2391,7 +2700,7 @@
                 <w:color w:val="232323"/>
                 <w:sz w:val="18"/>
               </w:rPr>
-              <w:t>Propuestas, TTL, reintentos concurrentes, lost-response, read-unavailable</w:t>
+              <w:t>Propuestas, TTL, concurrencia, lost-response, read-unavailable</w:t>
             </w:r>
           </w:p>
         </w:tc>
@@ -2468,7 +2777,7 @@
                 <w:color w:val="232323"/>
                 <w:sz w:val="18"/>
               </w:rPr>
-              <w:t>Trazabilidad de eventos, permisos de operador, vacíos de evidencia y metadatos</w:t>
+              <w:t>Telemetría de eventos, permisos de operador, vacíos de evidencia y metadatos</w:t>
             </w:r>
           </w:p>
         </w:tc>
@@ -2724,84 +3033,7 @@
                 <w:color w:val="232323"/>
                 <w:sz w:val="18"/>
               </w:rPr>
-              <w:t>Compilación exitosa</w:t>
-            </w:r>
-          </w:p>
-        </w:tc>
-      </w:tr>
-      <w:tr>
-        <w:tc>
-          <w:tcPr>
-            <w:tcW w:type="dxa" w:w="2592"/>
-            <w:shd w:fill="FFFFFF"/>
-            <w:tcMar>
-              <w:top w:w="90" w:type="dxa"/>
-              <w:bottom w:w="90" w:type="dxa"/>
-              <w:left w:w="130" w:type="dxa"/>
-              <w:right w:w="130" w:type="dxa"/>
-            </w:tcMar>
-          </w:tcPr>
-          <w:p>
-            <w:pPr>
-              <w:jc w:val="left"/>
-            </w:pPr>
-            <w:r>
-              <w:rPr>
-                <w:rFonts w:ascii="Arial" w:hAnsi="Arial"/>
-                <w:color w:val="232323"/>
-                <w:sz w:val="18"/>
-              </w:rPr>
-              <w:t>Revisión Independiente</w:t>
-            </w:r>
-          </w:p>
-        </w:tc>
-        <w:tc>
-          <w:tcPr>
-            <w:tcW w:type="dxa" w:w="4608"/>
-            <w:shd w:fill="FFFFFF"/>
-            <w:tcMar>
-              <w:top w:w="90" w:type="dxa"/>
-              <w:bottom w:w="90" w:type="dxa"/>
-              <w:left w:w="130" w:type="dxa"/>
-              <w:right w:w="130" w:type="dxa"/>
-            </w:tcMar>
-          </w:tcPr>
-          <w:p>
-            <w:pPr>
-              <w:jc w:val="left"/>
-            </w:pPr>
-            <w:r>
-              <w:rPr>
-                <w:rFonts w:ascii="Arial" w:hAnsi="Arial"/>
-                <w:color w:val="232323"/>
-                <w:sz w:val="18"/>
-              </w:rPr>
-              <w:t>Auditoría de seguridad y edge cases de reintento</w:t>
-            </w:r>
-          </w:p>
-        </w:tc>
-        <w:tc>
-          <w:tcPr>
-            <w:tcW w:type="dxa" w:w="2160"/>
-            <w:shd w:fill="FFFFFF"/>
-            <w:tcMar>
-              <w:top w:w="90" w:type="dxa"/>
-              <w:bottom w:w="90" w:type="dxa"/>
-              <w:left w:w="130" w:type="dxa"/>
-              <w:right w:w="130" w:type="dxa"/>
-            </w:tcMar>
-          </w:tcPr>
-          <w:p>
-            <w:pPr>
-              <w:jc w:val="left"/>
-            </w:pPr>
-            <w:r>
-              <w:rPr>
-                <w:rFonts w:ascii="Arial" w:hAnsi="Arial"/>
-                <w:color w:val="232323"/>
-                <w:sz w:val="18"/>
-              </w:rPr>
-              <w:t>Aprobada sin bloqueos</w:t>
+              <w:t>Compilación exitosa (0 errores)</w:t>
             </w:r>
           </w:p>
         </w:tc>
@@ -2850,13 +3082,13 @@
     </w:p>
     <w:p>
       <w:r>
-        <w:t>1. Abrir http://127.0.0.1:3000.</w:t>
+        <w:t>1. Iniciar la aplicación y navegar a http://127.0.0.1:3000.</w:t>
         <w:br/>
-        <w:t>2. Seleccionar 'Lucía' para crear y confirmar una propuesta de transferencia hacia 'Bruno'.</w:t>
+        <w:t>2. Iniciar sesión como 'Lucía' para crear y confirmar una transferencia hacia 'Bruno'.</w:t>
         <w:br/>
-        <w:t>3. Cambiar al usuario 'Marta' (Operador) y abrir el caso de soporte para observar el análisis del Copilot y la discrepancia histórica.</w:t>
+        <w:t>3. Cambiar de usuario a 'Marta' (Operador) y acceder a la sección de soporte para observar el análisis del Copilot y la discrepancia detectada.</w:t>
         <w:br/>
-        <w:t>4. En una terminal adicional, ejecutar 'node scripts/demo-support.mjs' para simular un caso nuevo con 8 eventos y verificar su trazabilidad en vivo.</w:t>
+        <w:t>4. En una terminal paralela, ejecutar 'node scripts/demo-support.mjs' para inyectar un caso nuevo con 8 eventos de telemetría y ver la actualización en vivo.</w:t>
       </w:r>
     </w:p>
     <w:p>
@@ -2891,7 +3123,7 @@
         <w:t xml:space="preserve">banana-bank-maximo-porretti.zip: </w:t>
       </w:r>
       <w:r>
-        <w:t>Ubicado en delivery/. Contiene el código fuente completo, .agents/, AGENTS.md, la suite de tests, fixtures, evidencias JSON, capturas de pantalla, las sesiones originales de IA y este documento explicativo.</w:t>
+        <w:t>Ubicado en delivery/. Contiene el código fuente completo, .agent/, .agents/, AGENTS.md, la suite de tests, fixtures, evidencias JSON, capturas de pantalla, las sesiones originales de IA y este documento explicativo oficial en formato Word.</w:t>
       </w:r>
     </w:p>
     <w:p>
@@ -2907,7 +3139,7 @@
         <w:t xml:space="preserve">Exclusiones Estrictas: </w:t>
       </w:r>
       <w:r>
-        <w:t>Se excluyeron node_modules, .next, .data, bases de datos locales, archivos .env con credenciales y .git, asegurando un empaquetado limpio y sin fugas de secretos.</w:t>
+        <w:t>Se excluyeron rigurosamente node_modules, .next, .data, bases de datos locales, archivos .env con credenciales y .git, asegurando un empaquetado completamente limpio y reproducible.</w:t>
       </w:r>
     </w:p>
     <w:p>
@@ -2923,7 +3155,7 @@
         <w:t xml:space="preserve">Sesiones Originales de IA: </w:t>
       </w:r>
       <w:r>
-        <w:t>Almacenadas en submission/ai-sessions/ con su archivo manifest.json y hashes SHA-256 para verificación de autenticidad.</w:t>
+        <w:t>Almacenadas en submission/ai-sessions/ con su archivo manifest.json y hashes criptográficos SHA-256 para verificación de autenticidad.</w:t>
       </w:r>
     </w:p>
     <w:p>
@@ -2936,10 +3168,26 @@
           <w:b/>
           <w:color w:val="191919"/>
         </w:rPr>
-        <w:t xml:space="preserve">Borrador de Envío: </w:t>
+        <w:t xml:space="preserve">Documento Explicativo Oficial: </w:t>
       </w:r>
       <w:r>
-        <w:t>Preparado en submission/email-draft.txt dirigido a hr@tdots.es con el asunto exacto requerido: Maximo Porretti - Banana Bank Technical Challenge.</w:t>
+        <w:t>Este documento Word (banana-bank-entregable.docx) constituye el único artefacto explicativo formal de entrega, habiéndose depurado documentación y borradores redundantes.</w:t>
+      </w:r>
+    </w:p>
+    <w:p>
+      <w:pPr>
+        <w:pStyle w:val="ListBullet"/>
+        <w:spacing w:after="60"/>
+      </w:pPr>
+      <w:r>
+        <w:rPr>
+          <w:b/>
+          <w:color w:val="191919"/>
+        </w:rPr>
+        <w:t xml:space="preserve">Asunto Oficial de Envío: </w:t>
+      </w:r>
+      <w:r>
+        <w:t>Maximo Porretti - Banana Bank Technical Challenge (destinado a hr@tdots.es).</w:t>
       </w:r>
     </w:p>
     <w:sectPr>

</xml_diff>